<commit_message>
Added FSDI-113 Assignment 1 Creating Signup Page
</commit_message>
<xml_diff>
--- a/FSDI 112 Assignment 1.docx
+++ b/FSDI 112 Assignment 1.docx
@@ -75,7 +75,7 @@
         <w:rPr>
           <w:rFonts w:ascii="Arial" w:hAnsi="Arial" w:cs="Arial"/>
         </w:rPr>
-        <w:t>2</w:t>
+        <w:t>3</w:t>
       </w:r>
       <w:r>
         <w:rPr>
@@ -107,7 +107,13 @@
         <w:rPr>
           <w:rFonts w:ascii="Arial" w:hAnsi="Arial" w:cs="Arial"/>
         </w:rPr>
-        <w:t>12</w:t>
+        <w:t>1</w:t>
+      </w:r>
+      <w:r>
+        <w:rPr>
+          <w:rFonts w:ascii="Arial" w:hAnsi="Arial" w:cs="Arial"/>
+        </w:rPr>
+        <w:t>3</w:t>
       </w:r>
       <w:r>
         <w:rPr>
@@ -232,7 +238,15 @@
           <w:b/>
           <w:bCs/>
         </w:rPr>
-        <w:t xml:space="preserve">/Logic </w:t>
+        <w:t>/Logic</w:t>
+      </w:r>
+      <w:r>
+        <w:rPr>
+          <w:rFonts w:ascii="Arial" w:hAnsi="Arial" w:cs="Arial"/>
+          <w:b/>
+          <w:bCs/>
+        </w:rPr>
+        <w:t>:</w:t>
       </w:r>
     </w:p>
     <w:p>
@@ -244,17 +258,46 @@
           <w:bCs/>
         </w:rPr>
       </w:pPr>
-      <w:r>
-        <w:rPr>
-          <w:rFonts w:ascii="Arial" w:hAnsi="Arial" w:cs="Arial"/>
-          <w:b/>
-          <w:bCs/>
+    </w:p>
+    <w:p>
+      <w:pPr>
+        <w:spacing w:line="360" w:lineRule="auto"/>
+        <w:rPr>
+          <w:rFonts w:ascii="Arial" w:hAnsi="Arial" w:cs="Arial"/>
+          <w:b/>
+          <w:bCs/>
+        </w:rPr>
+      </w:pPr>
+      <w:r>
+        <w:rPr>
+          <w:rFonts w:ascii="Arial" w:hAnsi="Arial" w:cs="Arial"/>
+          <w:b/>
+          <w:bCs/>
+        </w:rPr>
+        <w:t>Creating New User Account</w:t>
+      </w:r>
+    </w:p>
+    <w:p>
+      <w:pPr>
+        <w:spacing w:line="360" w:lineRule="auto"/>
+        <w:rPr>
+          <w:rFonts w:ascii="Arial" w:hAnsi="Arial" w:cs="Arial"/>
+          <w:b/>
+          <w:bCs/>
+        </w:rPr>
+      </w:pPr>
+      <w:r>
+        <w:rPr>
+          <w:rFonts w:ascii="Arial" w:hAnsi="Arial" w:cs="Arial"/>
+          <w:b/>
+          <w:bCs/>
+          <w:noProof/>
         </w:rPr>
         <w:drawing>
-          <wp:inline distT="0" distB="0" distL="0" distR="0" wp14:anchorId="712B104D" wp14:editId="728D74A2">
-            <wp:extent cx="5943600" cy="3343275"/>
-            <wp:effectExtent l="0" t="0" r="0" b="9525"/>
-            <wp:docPr id="1719235341" name="Picture 1"/>
+          <wp:inline distT="0" distB="0" distL="0" distR="0" wp14:anchorId="5FEFCFAF" wp14:editId="4747E873">
+            <wp:extent cx="5943600" cy="2259330"/>
+            <wp:effectExtent l="0" t="0" r="0" b="7620"/>
+            <wp:docPr id="1451810450" name="Picture 1"/>
             <wp:cNvGraphicFramePr>
               <a:graphicFrameLocks xmlns:a="http://schemas.openxmlformats.org/drawingml/2006/main" noChangeAspect="1"/>
             </wp:cNvGraphicFramePr>
@@ -262,7 +305,7 @@
               <a:graphicData uri="http://schemas.openxmlformats.org/drawingml/2006/picture">
                 <pic:pic xmlns:pic="http://schemas.openxmlformats.org/drawingml/2006/picture">
                   <pic:nvPicPr>
-                    <pic:cNvPr id="1719235341" name=""/>
+                    <pic:cNvPr id="1451810450" name=""/>
                     <pic:cNvPicPr/>
                   </pic:nvPicPr>
                   <pic:blipFill>
@@ -274,7 +317,7 @@
                   <pic:spPr>
                     <a:xfrm>
                       <a:off x="0" y="0"/>
-                      <a:ext cx="5943600" cy="3343275"/>
+                      <a:ext cx="5943600" cy="2259330"/>
                     </a:xfrm>
                     <a:prstGeom prst="rect">
                       <a:avLst/>
@@ -286,6 +329,158 @@
           </wp:inline>
         </w:drawing>
       </w:r>
+    </w:p>
+    <w:p>
+      <w:pPr>
+        <w:spacing w:line="360" w:lineRule="auto"/>
+        <w:rPr>
+          <w:rFonts w:ascii="Arial" w:hAnsi="Arial" w:cs="Arial"/>
+          <w:b/>
+          <w:bCs/>
+        </w:rPr>
+      </w:pPr>
+      <w:r>
+        <w:rPr>
+          <w:rFonts w:ascii="Arial" w:hAnsi="Arial" w:cs="Arial"/>
+          <w:b/>
+          <w:bCs/>
+        </w:rPr>
+        <w:t>Logging User In</w:t>
+      </w:r>
+    </w:p>
+    <w:p>
+      <w:pPr>
+        <w:spacing w:line="360" w:lineRule="auto"/>
+        <w:rPr>
+          <w:rFonts w:ascii="Arial" w:hAnsi="Arial" w:cs="Arial"/>
+          <w:b/>
+          <w:bCs/>
+        </w:rPr>
+      </w:pPr>
+      <w:r>
+        <w:rPr>
+          <w:rFonts w:ascii="Arial" w:hAnsi="Arial" w:cs="Arial"/>
+          <w:b/>
+          <w:bCs/>
+        </w:rPr>
+        <w:lastRenderedPageBreak/>
+        <w:drawing>
+          <wp:inline distT="0" distB="0" distL="0" distR="0" wp14:anchorId="11E65F8B" wp14:editId="39C7402C">
+            <wp:extent cx="5943600" cy="2148840"/>
+            <wp:effectExtent l="0" t="0" r="0" b="3810"/>
+            <wp:docPr id="103787437" name="Picture 1"/>
+            <wp:cNvGraphicFramePr>
+              <a:graphicFrameLocks xmlns:a="http://schemas.openxmlformats.org/drawingml/2006/main" noChangeAspect="1"/>
+            </wp:cNvGraphicFramePr>
+            <a:graphic xmlns:a="http://schemas.openxmlformats.org/drawingml/2006/main">
+              <a:graphicData uri="http://schemas.openxmlformats.org/drawingml/2006/picture">
+                <pic:pic xmlns:pic="http://schemas.openxmlformats.org/drawingml/2006/picture">
+                  <pic:nvPicPr>
+                    <pic:cNvPr id="103787437" name=""/>
+                    <pic:cNvPicPr/>
+                  </pic:nvPicPr>
+                  <pic:blipFill>
+                    <a:blip r:embed="rId9"/>
+                    <a:stretch>
+                      <a:fillRect/>
+                    </a:stretch>
+                  </pic:blipFill>
+                  <pic:spPr>
+                    <a:xfrm>
+                      <a:off x="0" y="0"/>
+                      <a:ext cx="5943600" cy="2148840"/>
+                    </a:xfrm>
+                    <a:prstGeom prst="rect">
+                      <a:avLst/>
+                    </a:prstGeom>
+                  </pic:spPr>
+                </pic:pic>
+              </a:graphicData>
+            </a:graphic>
+          </wp:inline>
+        </w:drawing>
+      </w:r>
+    </w:p>
+    <w:p>
+      <w:pPr>
+        <w:spacing w:line="360" w:lineRule="auto"/>
+        <w:rPr>
+          <w:rFonts w:ascii="Arial" w:hAnsi="Arial" w:cs="Arial"/>
+          <w:b/>
+          <w:bCs/>
+        </w:rPr>
+      </w:pPr>
+      <w:r>
+        <w:rPr>
+          <w:rFonts w:ascii="Arial" w:hAnsi="Arial" w:cs="Arial"/>
+          <w:b/>
+          <w:bCs/>
+        </w:rPr>
+        <w:t>Logging User Out</w:t>
+      </w:r>
+    </w:p>
+    <w:p>
+      <w:pPr>
+        <w:spacing w:line="360" w:lineRule="auto"/>
+        <w:rPr>
+          <w:rFonts w:ascii="Arial" w:hAnsi="Arial" w:cs="Arial"/>
+          <w:b/>
+          <w:bCs/>
+        </w:rPr>
+      </w:pPr>
+      <w:r>
+        <w:rPr>
+          <w:rFonts w:ascii="Arial" w:hAnsi="Arial" w:cs="Arial"/>
+          <w:b/>
+          <w:bCs/>
+        </w:rPr>
+        <w:drawing>
+          <wp:inline distT="0" distB="0" distL="0" distR="0" wp14:anchorId="2ED3189B" wp14:editId="19DFDE54">
+            <wp:extent cx="5943600" cy="1687830"/>
+            <wp:effectExtent l="0" t="0" r="0" b="7620"/>
+            <wp:docPr id="368190497" name="Picture 1"/>
+            <wp:cNvGraphicFramePr>
+              <a:graphicFrameLocks xmlns:a="http://schemas.openxmlformats.org/drawingml/2006/main" noChangeAspect="1"/>
+            </wp:cNvGraphicFramePr>
+            <a:graphic xmlns:a="http://schemas.openxmlformats.org/drawingml/2006/main">
+              <a:graphicData uri="http://schemas.openxmlformats.org/drawingml/2006/picture">
+                <pic:pic xmlns:pic="http://schemas.openxmlformats.org/drawingml/2006/picture">
+                  <pic:nvPicPr>
+                    <pic:cNvPr id="368190497" name=""/>
+                    <pic:cNvPicPr/>
+                  </pic:nvPicPr>
+                  <pic:blipFill>
+                    <a:blip r:embed="rId10"/>
+                    <a:stretch>
+                      <a:fillRect/>
+                    </a:stretch>
+                  </pic:blipFill>
+                  <pic:spPr>
+                    <a:xfrm>
+                      <a:off x="0" y="0"/>
+                      <a:ext cx="5943600" cy="1687830"/>
+                    </a:xfrm>
+                    <a:prstGeom prst="rect">
+                      <a:avLst/>
+                    </a:prstGeom>
+                  </pic:spPr>
+                </pic:pic>
+              </a:graphicData>
+            </a:graphic>
+          </wp:inline>
+        </w:drawing>
+      </w:r>
+    </w:p>
+    <w:p>
+      <w:pPr>
+        <w:spacing w:line="360" w:lineRule="auto"/>
+        <w:rPr>
+          <w:rFonts w:ascii="Arial" w:hAnsi="Arial" w:cs="Arial"/>
+          <w:b/>
+          <w:bCs/>
+          <w:noProof/>
+        </w:rPr>
+      </w:pPr>
       <w:r>
         <w:rPr>
           <w:rFonts w:ascii="Arial" w:hAnsi="Arial" w:cs="Arial"/>
@@ -367,7 +562,7 @@
       </w:pPr>
     </w:p>
     <w:sectPr>
-      <w:headerReference w:type="default" r:id="rId9"/>
+      <w:headerReference w:type="default" r:id="rId11"/>
       <w:pgSz w:w="12240" w:h="15840"/>
       <w:pgMar w:top="1440" w:right="1440" w:bottom="1440" w:left="1440" w:header="708" w:footer="708" w:gutter="0"/>
       <w:cols w:space="708"/>

</xml_diff>